<commit_message>
Convert Alert 10002 document to generic reusable template with placeholders
- Replace specific alert values with template variables ({{ALERT_ID}}, {{ALERT_NAME}}, etc.)
- Preserve original table format and document structure
- Enable reuse for generating documentation for any alert type
</commit_message>
<xml_diff>
--- a/Alert_10002_System_Down.docx
+++ b/Alert_10002_System_Down.docx
@@ -30,7 +30,7 @@
           <w:sz w:val="28"/>
           <w:szCs w:val="28"/>
         </w:rPr>
-        <w:t xml:space="preserve">System Down Alert - Template</w:t>
+        <w:t>Alert Article Template</w:t>
       </w:r>
     </w:p>
     <w:tbl>
@@ -172,7 +172,7 @@
                 <w:sz w:val="22"/>
                 <w:szCs w:val="22"/>
               </w:rPr>
-              <w:t xml:space="preserve">10002</w:t>
+              <w:t>{{ALERT_ID}}</w:t>
             </w:r>
           </w:p>
         </w:tc>
@@ -236,7 +236,7 @@
                 <w:sz w:val="22"/>
                 <w:szCs w:val="22"/>
               </w:rPr>
-              <w:t xml:space="preserve">System Down - Critical Service Unavailable</w:t>
+              <w:t>{{ALERT_NAME}}</w:t>
             </w:r>
           </w:p>
         </w:tc>
@@ -300,7 +300,7 @@
                 <w:sz w:val="22"/>
                 <w:szCs w:val="22"/>
               </w:rPr>
-              <w:t xml:space="preserve">P0 - Critical</w:t>
+              <w:t>{{PRIORITY_LEVEL}}</w:t>
             </w:r>
           </w:p>
         </w:tc>
@@ -364,7 +364,7 @@
                 <w:sz w:val="22"/>
                 <w:szCs w:val="22"/>
               </w:rPr>
-              <w:t xml:space="preserve">Infrastructure - Service Availability</w:t>
+              <w:t>{{ALERT_CATEGORY}}</w:t>
             </w:r>
           </w:p>
         </w:tc>
@@ -520,46 +520,46 @@
                 <w:sz w:val="22"/>
                 <w:szCs w:val="22"/>
               </w:rPr>
-              <w:t xml:space="preserve">• Service health check fails for 3 consecutive attempts (90 seconds)</w:t>
-            </w:r>
-          </w:p>
-          <w:p>
-            <w:pPr>
-              <w:spacing w:after="80"/>
-            </w:pPr>
-            <w:r>
-              <w:rPr>
-                <w:color w:val="000000"/>
-                <w:sz w:val="22"/>
-                <w:szCs w:val="22"/>
-              </w:rPr>
-              <w:t xml:space="preserve">• HTTP endpoint returns 500-level errors or times out</w:t>
-            </w:r>
-          </w:p>
-          <w:p>
-            <w:pPr>
-              <w:spacing w:after="80"/>
-            </w:pPr>
-            <w:r>
-              <w:rPr>
-                <w:color w:val="000000"/>
-                <w:sz w:val="22"/>
-                <w:szCs w:val="22"/>
-              </w:rPr>
-              <w:t xml:space="preserve">• Service process not running on monitored hosts</w:t>
-            </w:r>
-          </w:p>
-          <w:p>
-            <w:pPr>
-              <w:spacing w:after="80"/>
-            </w:pPr>
-            <w:r>
-              <w:rPr>
-                <w:color w:val="000000"/>
-                <w:sz w:val="22"/>
-                <w:szCs w:val="22"/>
-              </w:rPr>
-              <w:t xml:space="preserve">• Load balancer marks all backend instances as unhealthy</w:t>
+              <w:t>• {{TRIGGER_CONDITION_1}}</w:t>
+            </w:r>
+          </w:p>
+          <w:p>
+            <w:pPr>
+              <w:spacing w:after="80"/>
+            </w:pPr>
+            <w:r>
+              <w:rPr>
+                <w:color w:val="000000"/>
+                <w:sz w:val="22"/>
+                <w:szCs w:val="22"/>
+              </w:rPr>
+              <w:t>• {{TRIGGER_CONDITION_2}}</w:t>
+            </w:r>
+          </w:p>
+          <w:p>
+            <w:pPr>
+              <w:spacing w:after="80"/>
+            </w:pPr>
+            <w:r>
+              <w:rPr>
+                <w:color w:val="000000"/>
+                <w:sz w:val="22"/>
+                <w:szCs w:val="22"/>
+              </w:rPr>
+              <w:t>• {{TRIGGER_CONDITION_3}}</w:t>
+            </w:r>
+          </w:p>
+          <w:p>
+            <w:pPr>
+              <w:spacing w:after="80"/>
+            </w:pPr>
+            <w:r>
+              <w:rPr>
+                <w:color w:val="000000"/>
+                <w:sz w:val="22"/>
+                <w:szCs w:val="22"/>
+              </w:rPr>
+              <w:t>• {{TRIGGER_CONDITION_4}}</w:t>
             </w:r>
           </w:p>
         </w:tc>
@@ -624,59 +624,59 @@
                 <w:sz w:val="22"/>
                 <w:szCs w:val="22"/>
               </w:rPr>
-              <w:t xml:space="preserve">• Complete service unavailability for all users</w:t>
-            </w:r>
-          </w:p>
-          <w:p>
-            <w:pPr>
-              <w:spacing w:after="80"/>
-            </w:pPr>
-            <w:r>
-              <w:rPr>
-                <w:color w:val="000000"/>
-                <w:sz w:val="22"/>
-                <w:szCs w:val="22"/>
-              </w:rPr>
-              <w:t xml:space="preserve">• Revenue loss: Estimated $10,000+ per hour</w:t>
-            </w:r>
-          </w:p>
-          <w:p>
-            <w:pPr>
-              <w:spacing w:after="80"/>
-            </w:pPr>
-            <w:r>
-              <w:rPr>
-                <w:color w:val="000000"/>
-                <w:sz w:val="22"/>
-                <w:szCs w:val="22"/>
-              </w:rPr>
-              <w:t xml:space="preserve">• Customer satisfaction impact: High</w:t>
-            </w:r>
-          </w:p>
-          <w:p>
-            <w:pPr>
-              <w:spacing w:after="80"/>
-            </w:pPr>
-            <w:r>
-              <w:rPr>
-                <w:color w:val="000000"/>
-                <w:sz w:val="22"/>
-                <w:szCs w:val="22"/>
-              </w:rPr>
-              <w:t xml:space="preserve">• SLA breach: Yes - violates 99.9% uptime commitment</w:t>
-            </w:r>
-          </w:p>
-          <w:p>
-            <w:pPr>
-              <w:spacing w:after="80"/>
-            </w:pPr>
-            <w:r>
-              <w:rPr>
-                <w:color w:val="000000"/>
-                <w:sz w:val="22"/>
-                <w:szCs w:val="22"/>
-              </w:rPr>
-              <w:t xml:space="preserve">• Regulatory impact: Potential compliance violations for critical services</w:t>
+              <w:t>• {{SERVICE_IMPACT}}</w:t>
+            </w:r>
+          </w:p>
+          <w:p>
+            <w:pPr>
+              <w:spacing w:after="80"/>
+            </w:pPr>
+            <w:r>
+              <w:rPr>
+                <w:color w:val="000000"/>
+                <w:sz w:val="22"/>
+                <w:szCs w:val="22"/>
+              </w:rPr>
+              <w:t>• {{REVENUE_IMPACT}}</w:t>
+            </w:r>
+          </w:p>
+          <w:p>
+            <w:pPr>
+              <w:spacing w:after="80"/>
+            </w:pPr>
+            <w:r>
+              <w:rPr>
+                <w:color w:val="000000"/>
+                <w:sz w:val="22"/>
+                <w:szCs w:val="22"/>
+              </w:rPr>
+              <w:t>• {{CUSTOMER_IMPACT}}</w:t>
+            </w:r>
+          </w:p>
+          <w:p>
+            <w:pPr>
+              <w:spacing w:after="80"/>
+            </w:pPr>
+            <w:r>
+              <w:rPr>
+                <w:color w:val="000000"/>
+                <w:sz w:val="22"/>
+                <w:szCs w:val="22"/>
+              </w:rPr>
+              <w:t>• {{SLA_IMPACT}}</w:t>
+            </w:r>
+          </w:p>
+          <w:p>
+            <w:pPr>
+              <w:spacing w:after="80"/>
+            </w:pPr>
+            <w:r>
+              <w:rPr>
+                <w:color w:val="000000"/>
+                <w:sz w:val="22"/>
+                <w:szCs w:val="22"/>
+              </w:rPr>
+              <w:t>• Regulatory impact: {{REGULATORY_IMPACT}}</w:t>
             </w:r>
           </w:p>
         </w:tc>
@@ -740,7 +740,7 @@
                 <w:sz w:val="22"/>
                 <w:szCs w:val="22"/>
               </w:rPr>
-              <w:t xml:space="preserve">Infrastructure Operations Team</w:t>
+              <w:t>{{ALERT_OWNER_TEAM}}</w:t>
             </w:r>
           </w:p>
         </w:tc>
@@ -805,59 +805,59 @@
                 <w:sz w:val="22"/>
                 <w:szCs w:val="22"/>
               </w:rPr>
-              <w:t xml:space="preserve">• Email: infrastructure-critical@company.com</w:t>
-            </w:r>
-          </w:p>
-          <w:p>
-            <w:pPr>
-              <w:spacing w:after="80"/>
-            </w:pPr>
-            <w:r>
-              <w:rPr>
-                <w:color w:val="000000"/>
-                <w:sz w:val="22"/>
-                <w:szCs w:val="22"/>
-              </w:rPr>
-              <w:t xml:space="preserve">• Slack: #incidents-critical (with @channel mention)</w:t>
-            </w:r>
-          </w:p>
-          <w:p>
-            <w:pPr>
-              <w:spacing w:after="80"/>
-            </w:pPr>
-            <w:r>
-              <w:rPr>
-                <w:color w:val="000000"/>
-                <w:sz w:val="22"/>
-                <w:szCs w:val="22"/>
-              </w:rPr>
-              <w:t xml:space="preserve">• PagerDuty: Infrastructure On-Call (High Urgency)</w:t>
-            </w:r>
-          </w:p>
-          <w:p>
-            <w:pPr>
-              <w:spacing w:after="80"/>
-            </w:pPr>
-            <w:r>
-              <w:rPr>
-                <w:color w:val="000000"/>
-                <w:sz w:val="22"/>
-                <w:szCs w:val="22"/>
-              </w:rPr>
-              <w:t xml:space="preserve">• SMS: On-call engineer phone numbers</w:t>
-            </w:r>
-          </w:p>
-          <w:p>
-            <w:pPr>
-              <w:spacing w:after="80"/>
-            </w:pPr>
-            <w:r>
-              <w:rPr>
-                <w:color w:val="000000"/>
-                <w:sz w:val="22"/>
-                <w:szCs w:val="22"/>
-              </w:rPr>
-              <w:t xml:space="preserve">• Incident Management: Auto-create Jira ticket (P0 severity)</w:t>
+              <w:t>• Email: {{EMAIL_DISTRIBUTION_LIST}}</w:t>
+            </w:r>
+          </w:p>
+          <w:p>
+            <w:pPr>
+              <w:spacing w:after="80"/>
+            </w:pPr>
+            <w:r>
+              <w:rPr>
+                <w:color w:val="000000"/>
+                <w:sz w:val="22"/>
+                <w:szCs w:val="22"/>
+              </w:rPr>
+              <w:t>• Slack: {{CHAT_CHANNEL}}</w:t>
+            </w:r>
+          </w:p>
+          <w:p>
+            <w:pPr>
+              <w:spacing w:after="80"/>
+            </w:pPr>
+            <w:r>
+              <w:rPr>
+                <w:color w:val="000000"/>
+                <w:sz w:val="22"/>
+                <w:szCs w:val="22"/>
+              </w:rPr>
+              <w:t>• PagerDuty: {{ON_CALL_SCHEDULE}}</w:t>
+            </w:r>
+          </w:p>
+          <w:p>
+            <w:pPr>
+              <w:spacing w:after="80"/>
+            </w:pPr>
+            <w:r>
+              <w:rPr>
+                <w:color w:val="000000"/>
+                <w:sz w:val="22"/>
+                <w:szCs w:val="22"/>
+              </w:rPr>
+              <w:t>• SMS: {{SMS_CONTACTS}}</w:t>
+            </w:r>
+          </w:p>
+          <w:p>
+            <w:pPr>
+              <w:spacing w:after="80"/>
+            </w:pPr>
+            <w:r>
+              <w:rPr>
+                <w:color w:val="000000"/>
+                <w:sz w:val="22"/>
+                <w:szCs w:val="22"/>
+              </w:rPr>
+              <w:t>• Incident Management: {{INCIDENT_TOOL_AND_SEVERITY}}</w:t>
             </w:r>
           </w:p>
         </w:tc>
@@ -922,59 +922,59 @@
                 <w:sz w:val="22"/>
                 <w:szCs w:val="22"/>
               </w:rPr>
-              <w:t xml:space="preserve">1. Acknowledge alert within 5 minutes</w:t>
-            </w:r>
-          </w:p>
-          <w:p>
-            <w:pPr>
-              <w:spacing w:after="80"/>
-            </w:pPr>
-            <w:r>
-              <w:rPr>
-                <w:color w:val="000000"/>
-                <w:sz w:val="22"/>
-                <w:szCs w:val="22"/>
-              </w:rPr>
-              <w:t xml:space="preserve">2. Check service status dashboard: https://status.company.com</w:t>
-            </w:r>
-          </w:p>
-          <w:p>
-            <w:pPr>
-              <w:spacing w:after="80"/>
-            </w:pPr>
-            <w:r>
-              <w:rPr>
-                <w:color w:val="000000"/>
-                <w:sz w:val="22"/>
-                <w:szCs w:val="22"/>
-              </w:rPr>
-              <w:t xml:space="preserve">3. Verify health check endpoint: curl -v https://api.company.com/health</w:t>
-            </w:r>
-          </w:p>
-          <w:p>
-            <w:pPr>
-              <w:spacing w:after="80"/>
-            </w:pPr>
-            <w:r>
-              <w:rPr>
-                <w:color w:val="000000"/>
-                <w:sz w:val="22"/>
-                <w:szCs w:val="22"/>
-              </w:rPr>
-              <w:t xml:space="preserve">4. Check recent deployments: kubectl get deployments -n production</w:t>
-            </w:r>
-          </w:p>
-          <w:p>
-            <w:pPr>
-              <w:spacing w:after="80"/>
-            </w:pPr>
-            <w:r>
-              <w:rPr>
-                <w:color w:val="000000"/>
-                <w:sz w:val="22"/>
-                <w:szCs w:val="22"/>
-              </w:rPr>
-              <w:t xml:space="preserve">5. Review error logs: tail -100 /var/log/service/error.log</w:t>
+              <w:t>1. Acknowledge alert within {{ACKNOWLEDGEMENT_SLA_MINUTES}} minutes</w:t>
+            </w:r>
+          </w:p>
+          <w:p>
+            <w:pPr>
+              <w:spacing w:after="80"/>
+            </w:pPr>
+            <w:r>
+              <w:rPr>
+                <w:color w:val="000000"/>
+                <w:sz w:val="22"/>
+                <w:szCs w:val="22"/>
+              </w:rPr>
+              <w:t>2. Check service status dashboard: {{STATUS_DASHBOARD_URL}}</w:t>
+            </w:r>
+          </w:p>
+          <w:p>
+            <w:pPr>
+              <w:spacing w:after="80"/>
+            </w:pPr>
+            <w:r>
+              <w:rPr>
+                <w:color w:val="000000"/>
+                <w:sz w:val="22"/>
+                <w:szCs w:val="22"/>
+              </w:rPr>
+              <w:t>3. Verify health check endpoint: {{HEALTH_CHECK_COMMAND}}</w:t>
+            </w:r>
+          </w:p>
+          <w:p>
+            <w:pPr>
+              <w:spacing w:after="80"/>
+            </w:pPr>
+            <w:r>
+              <w:rPr>
+                <w:color w:val="000000"/>
+                <w:sz w:val="22"/>
+                <w:szCs w:val="22"/>
+              </w:rPr>
+              <w:t>4. Check recent deployments: {{DEPLOYMENT_CHECK_COMMAND}}</w:t>
+            </w:r>
+          </w:p>
+          <w:p>
+            <w:pPr>
+              <w:spacing w:after="80"/>
+            </w:pPr>
+            <w:r>
+              <w:rPr>
+                <w:color w:val="000000"/>
+                <w:sz w:val="22"/>
+                <w:szCs w:val="22"/>
+              </w:rPr>
+              <w:t>5. Review error logs: {{LOG_CHECK_COMMAND}}</w:t>
             </w:r>
           </w:p>
           <w:p>
@@ -1078,46 +1078,46 @@
                 <w:sz w:val="22"/>
                 <w:szCs w:val="22"/>
               </w:rPr>
-              <w:t xml:space="preserve">• Restart service: systemctl restart service-name</w:t>
-            </w:r>
-          </w:p>
-          <w:p>
-            <w:pPr>
-              <w:spacing w:after="80"/>
-            </w:pPr>
-            <w:r>
-              <w:rPr>
-                <w:color w:val="000000"/>
-                <w:sz w:val="22"/>
-                <w:szCs w:val="22"/>
-              </w:rPr>
-              <w:t xml:space="preserve">• Scale up instances: kubectl scale deployment service-name --replicas=5</w:t>
-            </w:r>
-          </w:p>
-          <w:p>
-            <w:pPr>
-              <w:spacing w:after="80"/>
-            </w:pPr>
-            <w:r>
-              <w:rPr>
-                <w:color w:val="000000"/>
-                <w:sz w:val="22"/>
-                <w:szCs w:val="22"/>
-              </w:rPr>
-              <w:t xml:space="preserve">• Failover to DR site if primary region unavailable</w:t>
-            </w:r>
-          </w:p>
-          <w:p>
-            <w:pPr>
-              <w:spacing w:after="80"/>
-            </w:pPr>
-            <w:r>
-              <w:rPr>
-                <w:color w:val="000000"/>
-                <w:sz w:val="22"/>
-                <w:szCs w:val="22"/>
-              </w:rPr>
-              <w:t xml:space="preserve">• Enable maintenance mode to show user-friendly message</w:t>
+              <w:t>• {{IMMEDIATE_ACTION_1}}</w:t>
+            </w:r>
+          </w:p>
+          <w:p>
+            <w:pPr>
+              <w:spacing w:after="80"/>
+            </w:pPr>
+            <w:r>
+              <w:rPr>
+                <w:color w:val="000000"/>
+                <w:sz w:val="22"/>
+                <w:szCs w:val="22"/>
+              </w:rPr>
+              <w:t>• {{IMMEDIATE_ACTION_2}}</w:t>
+            </w:r>
+          </w:p>
+          <w:p>
+            <w:pPr>
+              <w:spacing w:after="80"/>
+            </w:pPr>
+            <w:r>
+              <w:rPr>
+                <w:color w:val="000000"/>
+                <w:sz w:val="22"/>
+                <w:szCs w:val="22"/>
+              </w:rPr>
+              <w:t>• {{IMMEDIATE_ACTION_3}}</w:t>
+            </w:r>
+          </w:p>
+          <w:p>
+            <w:pPr>
+              <w:spacing w:after="80"/>
+            </w:pPr>
+            <w:r>
+              <w:rPr>
+                <w:color w:val="000000"/>
+                <w:sz w:val="22"/>
+                <w:szCs w:val="22"/>
+              </w:rPr>
+              <w:t>• {{IMMEDIATE_ACTION_4}}</w:t>
             </w:r>
           </w:p>
           <w:p>
@@ -1156,46 +1156,46 @@
                 <w:sz w:val="22"/>
                 <w:szCs w:val="22"/>
               </w:rPr>
-              <w:t xml:space="preserve">• Review application logs for exceptions or errors</w:t>
-            </w:r>
-          </w:p>
-          <w:p>
-            <w:pPr>
-              <w:spacing w:after="80"/>
-            </w:pPr>
-            <w:r>
-              <w:rPr>
-                <w:color w:val="000000"/>
-                <w:sz w:val="22"/>
-                <w:szCs w:val="22"/>
-              </w:rPr>
-              <w:t xml:space="preserve">• Check database connection pool status</w:t>
-            </w:r>
-          </w:p>
-          <w:p>
-            <w:pPr>
-              <w:spacing w:after="80"/>
-            </w:pPr>
-            <w:r>
-              <w:rPr>
-                <w:color w:val="000000"/>
-                <w:sz w:val="22"/>
-                <w:szCs w:val="22"/>
-              </w:rPr>
-              <w:t xml:space="preserve">• Verify external dependency availability (APIs, databases)</w:t>
-            </w:r>
-          </w:p>
-          <w:p>
-            <w:pPr>
-              <w:spacing w:after="80"/>
-            </w:pPr>
-            <w:r>
-              <w:rPr>
-                <w:color w:val="000000"/>
-                <w:sz w:val="22"/>
-                <w:szCs w:val="22"/>
-              </w:rPr>
-              <w:t xml:space="preserve">• Review recent code deployments or configuration changes</w:t>
+              <w:t>• {{INVESTIGATION_STEP_1}}</w:t>
+            </w:r>
+          </w:p>
+          <w:p>
+            <w:pPr>
+              <w:spacing w:after="80"/>
+            </w:pPr>
+            <w:r>
+              <w:rPr>
+                <w:color w:val="000000"/>
+                <w:sz w:val="22"/>
+                <w:szCs w:val="22"/>
+              </w:rPr>
+              <w:t>• {{INVESTIGATION_STEP_2}}</w:t>
+            </w:r>
+          </w:p>
+          <w:p>
+            <w:pPr>
+              <w:spacing w:after="80"/>
+            </w:pPr>
+            <w:r>
+              <w:rPr>
+                <w:color w:val="000000"/>
+                <w:sz w:val="22"/>
+                <w:szCs w:val="22"/>
+              </w:rPr>
+              <w:t>• {{INVESTIGATION_STEP_3}}</w:t>
+            </w:r>
+          </w:p>
+          <w:p>
+            <w:pPr>
+              <w:spacing w:after="80"/>
+            </w:pPr>
+            <w:r>
+              <w:rPr>
+                <w:color w:val="000000"/>
+                <w:sz w:val="22"/>
+                <w:szCs w:val="22"/>
+              </w:rPr>
+              <w:t>• {{INVESTIGATION_STEP_4}}</w:t>
             </w:r>
           </w:p>
           <w:p>
@@ -1234,46 +1234,46 @@
                 <w:sz w:val="22"/>
                 <w:szCs w:val="22"/>
               </w:rPr>
-              <w:t xml:space="preserve">• Rollback recent deployment if identified as root cause</w:t>
-            </w:r>
-          </w:p>
-          <w:p>
-            <w:pPr>
-              <w:spacing w:after="80"/>
-            </w:pPr>
-            <w:r>
-              <w:rPr>
-                <w:color w:val="000000"/>
-                <w:sz w:val="22"/>
-                <w:szCs w:val="22"/>
-              </w:rPr>
-              <w:t xml:space="preserve">• Apply hotfix for critical bugs</w:t>
-            </w:r>
-          </w:p>
-          <w:p>
-            <w:pPr>
-              <w:spacing w:after="80"/>
-            </w:pPr>
-            <w:r>
-              <w:rPr>
-                <w:color w:val="000000"/>
-                <w:sz w:val="22"/>
-                <w:szCs w:val="22"/>
-              </w:rPr>
-              <w:t xml:space="preserve">• Restore from backup if data corruption detected</w:t>
-            </w:r>
-          </w:p>
-          <w:p>
-            <w:pPr>
-              <w:spacing w:after="80"/>
-            </w:pPr>
-            <w:r>
-              <w:rPr>
-                <w:color w:val="000000"/>
-                <w:sz w:val="22"/>
-                <w:szCs w:val="22"/>
-              </w:rPr>
-              <w:t xml:space="preserve">• Re-enable traffic routing after service health confirmed</w:t>
+              <w:t>• {{RESOLUTION_ACTION_1}}</w:t>
+            </w:r>
+          </w:p>
+          <w:p>
+            <w:pPr>
+              <w:spacing w:after="80"/>
+            </w:pPr>
+            <w:r>
+              <w:rPr>
+                <w:color w:val="000000"/>
+                <w:sz w:val="22"/>
+                <w:szCs w:val="22"/>
+              </w:rPr>
+              <w:t>• {{RESOLUTION_ACTION_2}}</w:t>
+            </w:r>
+          </w:p>
+          <w:p>
+            <w:pPr>
+              <w:spacing w:after="80"/>
+            </w:pPr>
+            <w:r>
+              <w:rPr>
+                <w:color w:val="000000"/>
+                <w:sz w:val="22"/>
+                <w:szCs w:val="22"/>
+              </w:rPr>
+              <w:t>• {{RESOLUTION_ACTION_3}}</w:t>
+            </w:r>
+          </w:p>
+          <w:p>
+            <w:pPr>
+              <w:spacing w:after="80"/>
+            </w:pPr>
+            <w:r>
+              <w:rPr>
+                <w:color w:val="000000"/>
+                <w:sz w:val="22"/>
+                <w:szCs w:val="22"/>
+              </w:rPr>
+              <w:t>• {{RESOLUTION_ACTION_4}}</w:t>
             </w:r>
           </w:p>
         </w:tc>
@@ -1338,46 +1338,46 @@
                 <w:sz w:val="22"/>
                 <w:szCs w:val="22"/>
               </w:rPr>
-              <w:t xml:space="preserve">Tier 1 (0-5 min): Infrastructure Operations On-Call Engineer</w:t>
-            </w:r>
-          </w:p>
-          <w:p>
-            <w:pPr>
-              <w:spacing w:after="80"/>
-            </w:pPr>
-            <w:r>
-              <w:rPr>
-                <w:color w:val="000000"/>
-                <w:sz w:val="22"/>
-                <w:szCs w:val="22"/>
-              </w:rPr>
-              <w:t xml:space="preserve">Tier 2 (5-15 min): Infrastructure Engineering Lead</w:t>
-            </w:r>
-          </w:p>
-          <w:p>
-            <w:pPr>
-              <w:spacing w:after="80"/>
-            </w:pPr>
-            <w:r>
-              <w:rPr>
-                <w:color w:val="000000"/>
-                <w:sz w:val="22"/>
-                <w:szCs w:val="22"/>
-              </w:rPr>
-              <w:t xml:space="preserve">Tier 3 (15-30 min): Engineering Manager + Incident Commander</w:t>
-            </w:r>
-          </w:p>
-          <w:p>
-            <w:pPr>
-              <w:spacing w:after="80"/>
-            </w:pPr>
-            <w:r>
-              <w:rPr>
-                <w:color w:val="000000"/>
-                <w:sz w:val="22"/>
-                <w:szCs w:val="22"/>
-              </w:rPr>
-              <w:t xml:space="preserve">Tier 4 (30+ min): VP Engineering + Executive Leadership</w:t>
+              <w:t>Tier 1 ({{T1_TIME_WINDOW}}): {{TIER1_OWNER}}</w:t>
+            </w:r>
+          </w:p>
+          <w:p>
+            <w:pPr>
+              <w:spacing w:after="80"/>
+            </w:pPr>
+            <w:r>
+              <w:rPr>
+                <w:color w:val="000000"/>
+                <w:sz w:val="22"/>
+                <w:szCs w:val="22"/>
+              </w:rPr>
+              <w:t>Tier 2 ({{T2_TIME_WINDOW}}): {{TIER2_OWNER}}</w:t>
+            </w:r>
+          </w:p>
+          <w:p>
+            <w:pPr>
+              <w:spacing w:after="80"/>
+            </w:pPr>
+            <w:r>
+              <w:rPr>
+                <w:color w:val="000000"/>
+                <w:sz w:val="22"/>
+                <w:szCs w:val="22"/>
+              </w:rPr>
+              <w:t>Tier 3 ({{T3_TIME_WINDOW}}): {{TIER3_OWNER}}</w:t>
+            </w:r>
+          </w:p>
+          <w:p>
+            <w:pPr>
+              <w:spacing w:after="80"/>
+            </w:pPr>
+            <w:r>
+              <w:rPr>
+                <w:color w:val="000000"/>
+                <w:sz w:val="22"/>
+                <w:szCs w:val="22"/>
+              </w:rPr>
+              <w:t>Tier 4 ({{T4_TIME_WINDOW}}): {{TIER4_OWNER}}</w:t>
             </w:r>
           </w:p>
           <w:p>
@@ -1416,46 +1416,46 @@
                 <w:sz w:val="22"/>
                 <w:szCs w:val="22"/>
               </w:rPr>
-              <w:t xml:space="preserve">• Unable to restore service within 15 minutes</w:t>
-            </w:r>
-          </w:p>
-          <w:p>
-            <w:pPr>
-              <w:spacing w:after="80"/>
-            </w:pPr>
-            <w:r>
-              <w:rPr>
-                <w:color w:val="000000"/>
-                <w:sz w:val="22"/>
-                <w:szCs w:val="22"/>
-              </w:rPr>
-              <w:t xml:space="preserve">• Multiple services affected simultaneously</w:t>
-            </w:r>
-          </w:p>
-          <w:p>
-            <w:pPr>
-              <w:spacing w:after="80"/>
-            </w:pPr>
-            <w:r>
-              <w:rPr>
-                <w:color w:val="000000"/>
-                <w:sz w:val="22"/>
-                <w:szCs w:val="22"/>
-              </w:rPr>
-              <w:t xml:space="preserve">• Data loss or corruption suspected</w:t>
-            </w:r>
-          </w:p>
-          <w:p>
-            <w:pPr>
-              <w:spacing w:after="80"/>
-            </w:pPr>
-            <w:r>
-              <w:rPr>
-                <w:color w:val="000000"/>
-                <w:sz w:val="22"/>
-                <w:szCs w:val="22"/>
-              </w:rPr>
-              <w:t xml:space="preserve">• Security incident involved</w:t>
+              <w:t>• {{ESCALATION_TRIGGER_1}}</w:t>
+            </w:r>
+          </w:p>
+          <w:p>
+            <w:pPr>
+              <w:spacing w:after="80"/>
+            </w:pPr>
+            <w:r>
+              <w:rPr>
+                <w:color w:val="000000"/>
+                <w:sz w:val="22"/>
+                <w:szCs w:val="22"/>
+              </w:rPr>
+              <w:t>• {{ESCALATION_TRIGGER_2}}</w:t>
+            </w:r>
+          </w:p>
+          <w:p>
+            <w:pPr>
+              <w:spacing w:after="80"/>
+            </w:pPr>
+            <w:r>
+              <w:rPr>
+                <w:color w:val="000000"/>
+                <w:sz w:val="22"/>
+                <w:szCs w:val="22"/>
+              </w:rPr>
+              <w:t>• {{ESCALATION_TRIGGER_3}}</w:t>
+            </w:r>
+          </w:p>
+          <w:p>
+            <w:pPr>
+              <w:spacing w:after="80"/>
+            </w:pPr>
+            <w:r>
+              <w:rPr>
+                <w:color w:val="000000"/>
+                <w:sz w:val="22"/>
+                <w:szCs w:val="22"/>
+              </w:rPr>
+              <w:t>• {{ESCALATION_TRIGGER_4}}</w:t>
             </w:r>
           </w:p>
         </w:tc>
@@ -1519,7 +1519,7 @@
                 <w:sz w:val="22"/>
                 <w:szCs w:val="22"/>
               </w:rPr>
-              <w:t xml:space="preserve">Acknowledge: 5 min | Engage: 10 min | Resolve: 1 hour target</w:t>
+              <w:t>Acknowledge: {{ACK_SLA}} | Engage: {{ENGAGE_SLA}} | Resolve: {{RESOLUTION_TARGET}}</w:t>
             </w:r>
           </w:p>
         </w:tc>
@@ -1584,46 +1584,46 @@
                 <w:sz w:val="22"/>
                 <w:szCs w:val="22"/>
               </w:rPr>
-              <w:t xml:space="preserve">• Runbook: https://wiki.company.com/runbooks/system-down</w:t>
-            </w:r>
-          </w:p>
-          <w:p>
-            <w:pPr>
-              <w:spacing w:after="80"/>
-            </w:pPr>
-            <w:r>
-              <w:rPr>
-                <w:color w:val="000000"/>
-                <w:sz w:val="22"/>
-                <w:szCs w:val="22"/>
-              </w:rPr>
-              <w:t xml:space="preserve">• Architecture Diagram: https://wiki.company.com/architecture/service-overview</w:t>
-            </w:r>
-          </w:p>
-          <w:p>
-            <w:pPr>
-              <w:spacing w:after="80"/>
-            </w:pPr>
-            <w:r>
-              <w:rPr>
-                <w:color w:val="000000"/>
-                <w:sz w:val="22"/>
-                <w:szCs w:val="22"/>
-              </w:rPr>
-              <w:t xml:space="preserve">• Incident Playbook: https://wiki.company.com/playbooks/p0-incident</w:t>
-            </w:r>
-          </w:p>
-          <w:p>
-            <w:pPr>
-              <w:spacing w:after="80"/>
-            </w:pPr>
-            <w:r>
-              <w:rPr>
-                <w:color w:val="000000"/>
-                <w:sz w:val="22"/>
-                <w:szCs w:val="22"/>
-              </w:rPr>
-              <w:t xml:space="preserve">• DR Procedures: https://wiki.company.com/dr/failover-process</w:t>
+              <w:t>• Runbook: {{RUNBOOK_URL}}</w:t>
+            </w:r>
+          </w:p>
+          <w:p>
+            <w:pPr>
+              <w:spacing w:after="80"/>
+            </w:pPr>
+            <w:r>
+              <w:rPr>
+                <w:color w:val="000000"/>
+                <w:sz w:val="22"/>
+                <w:szCs w:val="22"/>
+              </w:rPr>
+              <w:t>• Architecture Diagram: {{ARCHITECTURE_URL}}</w:t>
+            </w:r>
+          </w:p>
+          <w:p>
+            <w:pPr>
+              <w:spacing w:after="80"/>
+            </w:pPr>
+            <w:r>
+              <w:rPr>
+                <w:color w:val="000000"/>
+                <w:sz w:val="22"/>
+                <w:szCs w:val="22"/>
+              </w:rPr>
+              <w:t>• Incident Playbook: {{PLAYBOOK_URL}}</w:t>
+            </w:r>
+          </w:p>
+          <w:p>
+            <w:pPr>
+              <w:spacing w:after="80"/>
+            </w:pPr>
+            <w:r>
+              <w:rPr>
+                <w:color w:val="000000"/>
+                <w:sz w:val="22"/>
+                <w:szCs w:val="22"/>
+              </w:rPr>
+              <w:t>• DR Procedures: {{DR_URL}}</w:t>
             </w:r>
           </w:p>
         </w:tc>
@@ -1701,59 +1701,59 @@
                 <w:sz w:val="22"/>
                 <w:szCs w:val="22"/>
               </w:rPr>
-              <w:t xml:space="preserve">• Database connection pool exhaustion (35%)</w:t>
-            </w:r>
-          </w:p>
-          <w:p>
-            <w:pPr>
-              <w:spacing w:after="80"/>
-            </w:pPr>
-            <w:r>
-              <w:rPr>
-                <w:color w:val="000000"/>
-                <w:sz w:val="22"/>
-                <w:szCs w:val="22"/>
-              </w:rPr>
-              <w:t xml:space="preserve">• Memory leaks leading to OOM errors (25%)</w:t>
-            </w:r>
-          </w:p>
-          <w:p>
-            <w:pPr>
-              <w:spacing w:after="80"/>
-            </w:pPr>
-            <w:r>
-              <w:rPr>
-                <w:color w:val="000000"/>
-                <w:sz w:val="22"/>
-                <w:szCs w:val="22"/>
-              </w:rPr>
-              <w:t xml:space="preserve">• External API timeouts causing cascading failures (20%)</w:t>
-            </w:r>
-          </w:p>
-          <w:p>
-            <w:pPr>
-              <w:spacing w:after="80"/>
-            </w:pPr>
-            <w:r>
-              <w:rPr>
-                <w:color w:val="000000"/>
-                <w:sz w:val="22"/>
-                <w:szCs w:val="22"/>
-              </w:rPr>
-              <w:t xml:space="preserve">• Configuration errors after deployment (15%)</w:t>
-            </w:r>
-          </w:p>
-          <w:p>
-            <w:pPr>
-              <w:spacing w:after="80"/>
-            </w:pPr>
-            <w:r>
-              <w:rPr>
-                <w:color w:val="000000"/>
-                <w:sz w:val="22"/>
-                <w:szCs w:val="22"/>
-              </w:rPr>
-              <w:t xml:space="preserve">• Infrastructure issues (network, disk, cloud provider) (5%)</w:t>
+              <w:t>• {{ROOT_CAUSE_1}}</w:t>
+            </w:r>
+          </w:p>
+          <w:p>
+            <w:pPr>
+              <w:spacing w:after="80"/>
+            </w:pPr>
+            <w:r>
+              <w:rPr>
+                <w:color w:val="000000"/>
+                <w:sz w:val="22"/>
+                <w:szCs w:val="22"/>
+              </w:rPr>
+              <w:t>• {{ROOT_CAUSE_2}}</w:t>
+            </w:r>
+          </w:p>
+          <w:p>
+            <w:pPr>
+              <w:spacing w:after="80"/>
+            </w:pPr>
+            <w:r>
+              <w:rPr>
+                <w:color w:val="000000"/>
+                <w:sz w:val="22"/>
+                <w:szCs w:val="22"/>
+              </w:rPr>
+              <w:t>• {{ROOT_CAUSE_3}}</w:t>
+            </w:r>
+          </w:p>
+          <w:p>
+            <w:pPr>
+              <w:spacing w:after="80"/>
+            </w:pPr>
+            <w:r>
+              <w:rPr>
+                <w:color w:val="000000"/>
+                <w:sz w:val="22"/>
+                <w:szCs w:val="22"/>
+              </w:rPr>
+              <w:t>• {{ROOT_CAUSE_4}}</w:t>
+            </w:r>
+          </w:p>
+          <w:p>
+            <w:pPr>
+              <w:spacing w:after="80"/>
+            </w:pPr>
+            <w:r>
+              <w:rPr>
+                <w:color w:val="000000"/>
+                <w:sz w:val="22"/>
+                <w:szCs w:val="22"/>
+              </w:rPr>
+              <w:t>• {{ROOT_CAUSE_5}}</w:t>
             </w:r>
           </w:p>
           <w:p>
@@ -1792,33 +1792,33 @@
                 <w:sz w:val="22"/>
                 <w:szCs w:val="22"/>
               </w:rPr>
-              <w:t xml:space="preserve">• 2025-01-15: Database failover issue - 45 min outage</w:t>
-            </w:r>
-          </w:p>
-          <w:p>
-            <w:pPr>
-              <w:spacing w:after="80"/>
-            </w:pPr>
-            <w:r>
-              <w:rPr>
-                <w:color w:val="000000"/>
-                <w:sz w:val="22"/>
-                <w:szCs w:val="22"/>
-              </w:rPr>
-              <w:t xml:space="preserve">• 2024-12-10: Memory leak in v2.3.1 - 2 hour degradation</w:t>
-            </w:r>
-          </w:p>
-          <w:p>
-            <w:pPr>
-              <w:spacing w:after="80"/>
-            </w:pPr>
-            <w:r>
-              <w:rPr>
-                <w:color w:val="000000"/>
-                <w:sz w:val="22"/>
-                <w:szCs w:val="22"/>
-              </w:rPr>
-              <w:t xml:space="preserve">• 2024-11-22: Cloud provider network outage - 30 min unavailability</w:t>
+              <w:t>• {{DATE_1}}: {{INCIDENT_SUMMARY_1}}</w:t>
+            </w:r>
+          </w:p>
+          <w:p>
+            <w:pPr>
+              <w:spacing w:after="80"/>
+            </w:pPr>
+            <w:r>
+              <w:rPr>
+                <w:color w:val="000000"/>
+                <w:sz w:val="22"/>
+                <w:szCs w:val="22"/>
+              </w:rPr>
+              <w:t>• {{DATE_2}}: {{INCIDENT_SUMMARY_2}}</w:t>
+            </w:r>
+          </w:p>
+          <w:p>
+            <w:pPr>
+              <w:spacing w:after="80"/>
+            </w:pPr>
+            <w:r>
+              <w:rPr>
+                <w:color w:val="000000"/>
+                <w:sz w:val="22"/>
+                <w:szCs w:val="22"/>
+              </w:rPr>
+              <w:t>• {{DATE_3}}: {{INCIDENT_SUMMARY_3}}</w:t>
             </w:r>
           </w:p>
         </w:tc>
@@ -1896,46 +1896,46 @@
                 <w:sz w:val="22"/>
                 <w:szCs w:val="22"/>
               </w:rPr>
-              <w:t xml:space="preserve">• PostgreSQL Primary Database</w:t>
-            </w:r>
-          </w:p>
-          <w:p>
-            <w:pPr>
-              <w:spacing w:after="80"/>
-            </w:pPr>
-            <w:r>
-              <w:rPr>
-                <w:color w:val="000000"/>
-                <w:sz w:val="22"/>
-                <w:szCs w:val="22"/>
-              </w:rPr>
-              <w:t xml:space="preserve">• Redis Cache Cluster</w:t>
-            </w:r>
-          </w:p>
-          <w:p>
-            <w:pPr>
-              <w:spacing w:after="80"/>
-            </w:pPr>
-            <w:r>
-              <w:rPr>
-                <w:color w:val="000000"/>
-                <w:sz w:val="22"/>
-                <w:szCs w:val="22"/>
-              </w:rPr>
-              <w:t xml:space="preserve">• Payment Gateway API</w:t>
-            </w:r>
-          </w:p>
-          <w:p>
-            <w:pPr>
-              <w:spacing w:after="80"/>
-            </w:pPr>
-            <w:r>
-              <w:rPr>
-                <w:color w:val="000000"/>
-                <w:sz w:val="22"/>
-                <w:szCs w:val="22"/>
-              </w:rPr>
-              <w:t xml:space="preserve">• Authentication Service</w:t>
+              <w:t>• {{UPSTREAM_DEPENDENCY_1}}</w:t>
+            </w:r>
+          </w:p>
+          <w:p>
+            <w:pPr>
+              <w:spacing w:after="80"/>
+            </w:pPr>
+            <w:r>
+              <w:rPr>
+                <w:color w:val="000000"/>
+                <w:sz w:val="22"/>
+                <w:szCs w:val="22"/>
+              </w:rPr>
+              <w:t>• {{UPSTREAM_DEPENDENCY_2}}</w:t>
+            </w:r>
+          </w:p>
+          <w:p>
+            <w:pPr>
+              <w:spacing w:after="80"/>
+            </w:pPr>
+            <w:r>
+              <w:rPr>
+                <w:color w:val="000000"/>
+                <w:sz w:val="22"/>
+                <w:szCs w:val="22"/>
+              </w:rPr>
+              <w:t>• {{UPSTREAM_DEPENDENCY_3}}</w:t>
+            </w:r>
+          </w:p>
+          <w:p>
+            <w:pPr>
+              <w:spacing w:after="80"/>
+            </w:pPr>
+            <w:r>
+              <w:rPr>
+                <w:color w:val="000000"/>
+                <w:sz w:val="22"/>
+                <w:szCs w:val="22"/>
+              </w:rPr>
+              <w:t>• {{UPSTREAM_DEPENDENCY_4}}</w:t>
             </w:r>
           </w:p>
           <w:p>
@@ -1974,46 +1974,46 @@
                 <w:sz w:val="22"/>
                 <w:szCs w:val="22"/>
               </w:rPr>
-              <w:t xml:space="preserve">• User-facing web application</w:t>
-            </w:r>
-          </w:p>
-          <w:p>
-            <w:pPr>
-              <w:spacing w:after="80"/>
-            </w:pPr>
-            <w:r>
-              <w:rPr>
-                <w:color w:val="000000"/>
-                <w:sz w:val="22"/>
-                <w:szCs w:val="22"/>
-              </w:rPr>
-              <w:t xml:space="preserve">• Mobile application APIs</w:t>
-            </w:r>
-          </w:p>
-          <w:p>
-            <w:pPr>
-              <w:spacing w:after="80"/>
-            </w:pPr>
-            <w:r>
-              <w:rPr>
-                <w:color w:val="000000"/>
-                <w:sz w:val="22"/>
-                <w:szCs w:val="22"/>
-              </w:rPr>
-              <w:t xml:space="preserve">• Partner integrations</w:t>
-            </w:r>
-          </w:p>
-          <w:p>
-            <w:pPr>
-              <w:spacing w:after="80"/>
-            </w:pPr>
-            <w:r>
-              <w:rPr>
-                <w:color w:val="000000"/>
-                <w:sz w:val="22"/>
-                <w:szCs w:val="22"/>
-              </w:rPr>
-              <w:t xml:space="preserve">• Reporting and analytics systems</w:t>
+              <w:t>• {{DOWNSTREAM_SYSTEM_1}}</w:t>
+            </w:r>
+          </w:p>
+          <w:p>
+            <w:pPr>
+              <w:spacing w:after="80"/>
+            </w:pPr>
+            <w:r>
+              <w:rPr>
+                <w:color w:val="000000"/>
+                <w:sz w:val="22"/>
+                <w:szCs w:val="22"/>
+              </w:rPr>
+              <w:t>• {{DOWNSTREAM_SYSTEM_2}}</w:t>
+            </w:r>
+          </w:p>
+          <w:p>
+            <w:pPr>
+              <w:spacing w:after="80"/>
+            </w:pPr>
+            <w:r>
+              <w:rPr>
+                <w:color w:val="000000"/>
+                <w:sz w:val="22"/>
+                <w:szCs w:val="22"/>
+              </w:rPr>
+              <w:t>• {{DOWNSTREAM_SYSTEM_3}}</w:t>
+            </w:r>
+          </w:p>
+          <w:p>
+            <w:pPr>
+              <w:spacing w:after="80"/>
+            </w:pPr>
+            <w:r>
+              <w:rPr>
+                <w:color w:val="000000"/>
+                <w:sz w:val="22"/>
+                <w:szCs w:val="22"/>
+              </w:rPr>
+              <w:t>• {{DOWNSTREAM_SYSTEM_4}}</w:t>
             </w:r>
           </w:p>
         </w:tc>
@@ -2091,59 +2091,59 @@
                 <w:sz w:val="22"/>
                 <w:szCs w:val="22"/>
               </w:rPr>
-              <w:t xml:space="preserve">1. Stop service process: systemctl stop service-name</w:t>
-            </w:r>
-          </w:p>
-          <w:p>
-            <w:pPr>
-              <w:spacing w:after="80"/>
-            </w:pPr>
-            <w:r>
-              <w:rPr>
-                <w:color w:val="000000"/>
-                <w:sz w:val="22"/>
-                <w:szCs w:val="22"/>
-              </w:rPr>
-              <w:t xml:space="preserve">2. Verify alert fires within 90 seconds</w:t>
-            </w:r>
-          </w:p>
-          <w:p>
-            <w:pPr>
-              <w:spacing w:after="80"/>
-            </w:pPr>
-            <w:r>
-              <w:rPr>
-                <w:color w:val="000000"/>
-                <w:sz w:val="22"/>
-                <w:szCs w:val="22"/>
-              </w:rPr>
-              <w:t xml:space="preserve">3. Confirm notifications sent to all channels</w:t>
-            </w:r>
-          </w:p>
-          <w:p>
-            <w:pPr>
-              <w:spacing w:after="80"/>
-            </w:pPr>
-            <w:r>
-              <w:rPr>
-                <w:color w:val="000000"/>
-                <w:sz w:val="22"/>
-                <w:szCs w:val="22"/>
-              </w:rPr>
-              <w:t xml:space="preserve">4. Restart service: systemctl start service-name</w:t>
-            </w:r>
-          </w:p>
-          <w:p>
-            <w:pPr>
-              <w:spacing w:after="80"/>
-            </w:pPr>
-            <w:r>
-              <w:rPr>
-                <w:color w:val="000000"/>
-                <w:sz w:val="22"/>
-                <w:szCs w:val="22"/>
-              </w:rPr>
-              <w:t xml:space="preserve">5. Verify recovery alert sent</w:t>
+              <w:t>1. {{TEST_STEP_1}}</w:t>
+            </w:r>
+          </w:p>
+          <w:p>
+            <w:pPr>
+              <w:spacing w:after="80"/>
+            </w:pPr>
+            <w:r>
+              <w:rPr>
+                <w:color w:val="000000"/>
+                <w:sz w:val="22"/>
+                <w:szCs w:val="22"/>
+              </w:rPr>
+              <w:t>2. {{TEST_STEP_2}}</w:t>
+            </w:r>
+          </w:p>
+          <w:p>
+            <w:pPr>
+              <w:spacing w:after="80"/>
+            </w:pPr>
+            <w:r>
+              <w:rPr>
+                <w:color w:val="000000"/>
+                <w:sz w:val="22"/>
+                <w:szCs w:val="22"/>
+              </w:rPr>
+              <w:t>3. {{TEST_STEP_3}}</w:t>
+            </w:r>
+          </w:p>
+          <w:p>
+            <w:pPr>
+              <w:spacing w:after="80"/>
+            </w:pPr>
+            <w:r>
+              <w:rPr>
+                <w:color w:val="000000"/>
+                <w:sz w:val="22"/>
+                <w:szCs w:val="22"/>
+              </w:rPr>
+              <w:t>4. {{TEST_STEP_4}}</w:t>
+            </w:r>
+          </w:p>
+          <w:p>
+            <w:pPr>
+              <w:spacing w:after="80"/>
+            </w:pPr>
+            <w:r>
+              <w:rPr>
+                <w:color w:val="000000"/>
+                <w:sz w:val="22"/>
+                <w:szCs w:val="22"/>
+              </w:rPr>
+              <w:t>5. {{TEST_STEP_5}}</w:t>
             </w:r>
           </w:p>
           <w:p>
@@ -2169,20 +2169,20 @@
                 <w:sz w:val="22"/>
                 <w:szCs w:val="22"/>
               </w:rPr>
-              <w:t xml:space="preserve">Last Tested: 2025-02-01</w:t>
-            </w:r>
-          </w:p>
-          <w:p>
-            <w:pPr>
-              <w:spacing w:after="80"/>
-            </w:pPr>
-            <w:r>
-              <w:rPr>
-                <w:color w:val="000000"/>
-                <w:sz w:val="22"/>
-                <w:szCs w:val="22"/>
-              </w:rPr>
-              <w:t xml:space="preserve">Test Frequency: Quarterly during maintenance window</w:t>
+              <w:t>Last Tested: {{LAST_TESTED_DATE}}</w:t>
+            </w:r>
+          </w:p>
+          <w:p>
+            <w:pPr>
+              <w:spacing w:after="80"/>
+            </w:pPr>
+            <w:r>
+              <w:rPr>
+                <w:color w:val="000000"/>
+                <w:sz w:val="22"/>
+                <w:szCs w:val="22"/>
+              </w:rPr>
+              <w:t>Test Frequency: {{TEST_FREQUENCY}}</w:t>
             </w:r>
           </w:p>
         </w:tc>
@@ -2246,7 +2246,7 @@
                 <w:sz w:val="22"/>
                 <w:szCs w:val="22"/>
               </w:rPr>
-              <w:t xml:space="preserve">Active</w:t>
+              <w:t>{{ALERT_STATUS}}</w:t>
             </w:r>
           </w:p>
         </w:tc>
@@ -2310,7 +2310,7 @@
                 <w:sz w:val="22"/>
                 <w:szCs w:val="22"/>
               </w:rPr>
-              <w:t xml:space="preserve">2024-01-15</w:t>
+              <w:t>{{CREATED_DATE}}</w:t>
             </w:r>
           </w:p>
         </w:tc>
@@ -2374,7 +2374,7 @@
                 <w:sz w:val="22"/>
                 <w:szCs w:val="22"/>
               </w:rPr>
-              <w:t xml:space="preserve">2025-02-10</w:t>
+              <w:t>{{LAST_MODIFIED_DATE}}</w:t>
             </w:r>
           </w:p>
         </w:tc>
@@ -2438,7 +2438,7 @@
                 <w:sz w:val="22"/>
                 <w:szCs w:val="22"/>
               </w:rPr>
-              <w:t xml:space="preserve">Infrastructure Operations Team</w:t>
+              <w:t>{{ALERT_OWNER_TEAM}}</w:t>
             </w:r>
           </w:p>
         </w:tc>

</xml_diff>

<commit_message>
Add template usage instructions and disclaimer at top of document
- Add prominent template header with warning symbol
- Include usage instructions explaining this is a reusable template
- Note that not all rows apply to every alert
- Instruct requesters to fill in applicable sections
- Clarify placeholder replacement with actual values
</commit_message>
<xml_diff>
--- a/Alert_10002_System_Down.docx
+++ b/Alert_10002_System_Down.docx
@@ -2,6 +2,31 @@
 <file path=word/document.xml><?xml version="1.0" encoding="utf-8"?>
 <w:document xmlns:wpc="http://schemas.microsoft.com/office/word/2010/wordprocessingCanvas" xmlns:mc="http://schemas.openxmlformats.org/markup-compatibility/2006" xmlns:o="urn:schemas-microsoft-com:office:office" xmlns:r="http://schemas.openxmlformats.org/officeDocument/2006/relationships" xmlns:m="http://schemas.openxmlformats.org/officeDocument/2006/math" xmlns:v="urn:schemas-microsoft-com:vml" xmlns:wp14="http://schemas.microsoft.com/office/word/2010/wordprocessingDrawing" xmlns:wp="http://schemas.openxmlformats.org/drawingml/2006/wordprocessingDrawing" xmlns:w10="urn:schemas-microsoft-com:office:word" xmlns:w="http://schemas.openxmlformats.org/wordprocessingml/2006/main" xmlns:w14="http://schemas.microsoft.com/office/word/2010/wordml" xmlns:w15="http://schemas.microsoft.com/office/word/2012/wordml" xmlns:wpg="http://schemas.microsoft.com/office/word/2010/wordprocessingGroup" xmlns:wpi="http://schemas.microsoft.com/office/word/2010/wordprocessingInk" xmlns:wne="http://schemas.microsoft.com/office/word/2006/wordml" xmlns:wps="http://schemas.microsoft.com/office/word/2010/wordprocessingShape" xmlns:cx="http://schemas.microsoft.com/office/drawing/2014/chartex" xmlns:cx1="http://schemas.microsoft.com/office/drawing/2015/9/8/chartex" xmlns:cx2="http://schemas.microsoft.com/office/drawing/2015/10/21/chartex" xmlns:cx3="http://schemas.microsoft.com/office/drawing/2016/5/9/chartex" xmlns:cx4="http://schemas.microsoft.com/office/drawing/2016/5/10/chartex" xmlns:cx5="http://schemas.microsoft.com/office/drawing/2016/5/11/chartex" xmlns:cx6="http://schemas.microsoft.com/office/drawing/2016/5/12/chartex" xmlns:cx7="http://schemas.microsoft.com/office/drawing/2016/5/13/chartex" xmlns:cx8="http://schemas.microsoft.com/office/drawing/2016/5/14/chartex" xmlns:aink="http://schemas.microsoft.com/office/drawing/2016/ink" xmlns:am3d="http://schemas.microsoft.com/office/drawing/2017/model3d" xmlns:w16cex="http://schemas.microsoft.com/office/word/2018/wordml/cex" xmlns:w16cid="http://schemas.microsoft.com/office/word/2016/wordml/cid" xmlns:w16="http://schemas.microsoft.com/office/word/2018/wordml" xmlns:w16sdtdh="http://schemas.microsoft.com/office/word/2020/wordml/sdtdatahash" xmlns:w16se="http://schemas.microsoft.com/office/word/2015/wordml/symex" mc:Ignorable="w14 w15 wp14">
   <w:body>
+    <w:p/>
+    <w:p>
+      <w:pPr>
+        <w:jc w:val="center"/>
+      </w:pPr>
+      <w:r>
+        <w:rPr>
+          <w:b/>
+          <w:color w:val="B22222"/>
+          <w:sz w:val="28"/>
+        </w:rPr>
+        <w:t>⚠️ TEMPLATE DOCUMENT ⚠️</w:t>
+      </w:r>
+    </w:p>
+    <w:p>
+      <w:r>
+        <w:rPr>
+          <w:i/>
+          <w:color w:val="000080"/>
+          <w:sz w:val="22"/>
+        </w:rPr>
+        <w:t>USAGE INSTRUCTIONS: This is a reusable template for creating alert documentation. Not all rows in this table may be applicable to every alert. As the alert requester, please fill in the rows to the best of your ability and as applicable to your specific alert. You may remove sections that are not relevant or add additional sections as needed. Replace all placeholder values (indicated by {{PLACEHOLDER_NAME}}) with actual values for your alert.</w:t>
+      </w:r>
+    </w:p>
+    <w:p/>
     <w:p>
       <w:pPr>
         <w:pStyle w:val="Heading1"/>

</xml_diff>